<commit_message>
Avance 2 documento final
</commit_message>
<xml_diff>
--- a/Bitacoras/Mayo-10 Bitácora.docx
+++ b/Bitacoras/Mayo-10 Bitácora.docx
@@ -174,25 +174,23 @@
                 <w:sz w:val="24"/>
                 <w:szCs w:val="24"/>
               </w:rPr>
-              <w:t xml:space="preserve">10 </w:t>
-            </w:r>
-            <w:proofErr w:type="gramStart"/>
-            <w:r>
-              <w:rPr>
-                <w:rFonts w:ascii="Arial" w:hAnsi="Arial" w:cs="Arial"/>
-                <w:sz w:val="24"/>
-                <w:szCs w:val="24"/>
-              </w:rPr>
-              <w:t>Mayo</w:t>
-            </w:r>
-            <w:proofErr w:type="gramEnd"/>
-            <w:r>
-              <w:rPr>
-                <w:rFonts w:ascii="Arial" w:hAnsi="Arial" w:cs="Arial"/>
-                <w:sz w:val="24"/>
-                <w:szCs w:val="24"/>
-              </w:rPr>
-              <w:t>, 2025</w:t>
+              <w:t>10 Mayo</w:t>
+            </w:r>
+            <w:r>
+              <w:rPr>
+                <w:rFonts w:ascii="Arial" w:hAnsi="Arial" w:cs="Arial"/>
+                <w:sz w:val="24"/>
+                <w:szCs w:val="24"/>
+              </w:rPr>
+              <w:t>, 202</w:t>
+            </w:r>
+            <w:r>
+              <w:rPr>
+                <w:rFonts w:ascii="Arial" w:hAnsi="Arial" w:cs="Arial"/>
+                <w:sz w:val="24"/>
+                <w:szCs w:val="24"/>
+              </w:rPr>
+              <w:t>6</w:t>
             </w:r>
           </w:p>
         </w:tc>

</xml_diff>